<commit_message>
V9: parallel-plane dialog, point skip, auto-close reference window
</commit_message>
<xml_diff>
--- a/MRC_Reslice_User_Guide.docx
+++ b/MRC_Reslice_User_Guide.docx
@@ -48,7 +48,7 @@
           <w:sz w:val="22"/>
           <w:szCs w:val="22"/>
         </w:rPr>
-        <w:t xml:space="preserve">Batch Normal-Vector Reslice — V8</w:t>
+        <w:t xml:space="preserve">Batch Normal-Vector Reslice — V9</w:t>
       </w:r>
     </w:p>
     <w:p>
@@ -1848,13 +1848,8 @@
           <w:sz w:val="22"/>
           <w:szCs w:val="22"/>
         </w:rPr>
-        <w:t xml:space="preserve">Reference window — shows XY, XZ, and YZ cross-sections side by side. Red crosshairs mark the surface point. This window is for orientation only. Close it when you are ready to begin drawing tangent lines.</w:t>
+        <w:t xml:space="preserve">Reference window — shows XY, XZ, and YZ cross-sections side by side. Red crosshairs mark the surface point.</w:t>
       </w:r>
-    </w:p>
-    <w:p>
-      <w:pPr>
-        <w:spacing w:before="60" w:after="0"/>
-      </w:pPr>
     </w:p>
     <w:p>
       <w:pPr>
@@ -1871,8 +1866,13 @@
           <w:sz w:val="22"/>
           <w:szCs w:val="22"/>
         </w:rPr>
-        <w:t xml:space="preserve">XY tangent window — shows the XY plane (constant Z slice) at full size.</w:t>
+        <w:t xml:space="preserve">Parallel-planes dialog — appears alongside the reference window. Indicate which planes (if any) the membrane runs parallel to, then click Proceed. The reference window closes automatically.</w:t>
       </w:r>
+    </w:p>
+    <w:p>
+      <w:pPr>
+        <w:spacing w:before="60" w:after="0"/>
+      </w:pPr>
     </w:p>
     <w:p>
       <w:pPr>
@@ -1889,7 +1889,7 @@
           <w:sz w:val="22"/>
           <w:szCs w:val="22"/>
         </w:rPr>
-        <w:t xml:space="preserve">XZ tangent window — shows the XZ plane (constant Y slice) at full size.</w:t>
+        <w:t xml:space="preserve">XY tangent window — shows the XY plane at full size (skipped if flagged as parallel).</w:t>
       </w:r>
     </w:p>
     <w:p>
@@ -1907,17 +1907,17 @@
           <w:sz w:val="22"/>
           <w:szCs w:val="22"/>
         </w:rPr>
-        <w:t xml:space="preserve">YZ tangent window — shows the YZ plane (constant X slice) at full size.</w:t>
+        <w:t xml:space="preserve">XZ tangent window — shows the XZ plane at full size (skipped if flagged as parallel).</w:t>
       </w:r>
     </w:p>
     <w:p>
       <w:pPr>
-        <w:spacing w:before="80" w:after="0"/>
-      </w:pPr>
-    </w:p>
-    <w:p>
-      <w:pPr>
-        <w:spacing w:before="60" w:after="100"/>
+        <w:pStyle w:val="ListParagraph"/>
+        <w:numPr>
+          <w:ilvl w:val="0"/>
+          <w:numId w:val="3"/>
+        </w:numPr>
+        <w:spacing w:before="40" w:after="80"/>
       </w:pPr>
       <w:r>
         <w:rPr>
@@ -1925,7 +1925,25 @@
           <w:sz w:val="22"/>
           <w:szCs w:val="22"/>
         </w:rPr>
-        <w:t xml:space="preserve">Each tangent window opens only after the previous one has been closed. When all three are complete, the normal vector is computed and reslicing begins automatically.</w:t>
+        <w:t xml:space="preserve">YZ tangent window — shows the YZ plane at full size (skipped if flagged as parallel).</w:t>
+      </w:r>
+    </w:p>
+    <w:p>
+      <w:pPr>
+        <w:spacing w:before="80" w:after="0"/>
+      </w:pPr>
+    </w:p>
+    <w:p>
+      <w:pPr>
+        <w:spacing w:before="60" w:after="100"/>
+      </w:pPr>
+      <w:r>
+        <w:rPr>
+          <w:rFonts w:ascii="Arial" w:cs="Arial" w:eastAsia="Arial" w:hAnsi="Arial"/>
+          <w:sz w:val="22"/>
+          <w:szCs w:val="22"/>
+        </w:rPr>
+        <w:t xml:space="preserve">Each tangent window opens only after the previous one has been closed. When all required tangent lines are complete, the normal vector is computed and reslicing begins automatically.</w:t>
       </w:r>
     </w:p>
     <w:p>
@@ -1946,7 +1964,7 @@
           <w:sz w:val="28"/>
           <w:szCs w:val="28"/>
         </w:rPr>
-        <w:t xml:space="preserve">4.3  How to draw a tangent line</w:t>
+        <w:t xml:space="preserve">4.3  The parallel-planes dialog</w:t>
       </w:r>
     </w:p>
     <w:p>
@@ -1959,7 +1977,7 @@
           <w:sz w:val="22"/>
           <w:szCs w:val="22"/>
         </w:rPr>
-        <w:t xml:space="preserve">Follow these steps in each tangent-picker window:</w:t>
+        <w:t xml:space="preserve">After the reference window opens, a small dialog appears on the right side of the screen. It remains visible alongside the reference window so you can use both at the same time.</w:t>
       </w:r>
     </w:p>
     <w:p>
@@ -2114,7 +2132,7 @@
                 <w:sz w:val="22"/>
                 <w:szCs w:val="22"/>
               </w:rPr>
-              <w:t xml:space="preserve">Locate the nuclear envelope</w:t>
+              <w:t xml:space="preserve">Examine the reference window</w:t>
             </w:r>
             <w:r>
               <w:rPr>
@@ -2124,7 +2142,7 @@
                 <w:sz w:val="22"/>
                 <w:szCs w:val="22"/>
               </w:rPr>
-              <w:t xml:space="preserve"> in the image. It typically appears as a bright or dark ring. The red crosshairs mark the point of interest on the envelope.</w:t>
+              <w:t xml:space="preserve"> to assess whether the nuclear envelope runs parallel to any of the three planes at the selected point.</w:t>
             </w:r>
           </w:p>
         </w:tc>
@@ -2193,7 +2211,7 @@
                 <w:sz w:val="22"/>
                 <w:szCs w:val="22"/>
               </w:rPr>
-              <w:t xml:space="preserve">Left-click the first point</w:t>
+              <w:t xml:space="preserve">Click any plane button (XY, XZ, or YZ)</w:t>
             </w:r>
             <w:r>
               <w:rPr>
@@ -2203,7 +2221,7 @@
                 <w:sz w:val="22"/>
                 <w:szCs w:val="22"/>
               </w:rPr>
-              <w:t xml:space="preserve"> somewhere along the visible edge of the nuclear envelope, close to the crosshair. A yellow dot marks the click.</w:t>
+              <w:t xml:space="preserve"> to toggle it. A toggled button turns green and shows "[parallel]". Click again to deactivate. Leave all buttons grey if no plane is parallel.</w:t>
             </w:r>
           </w:p>
         </w:tc>
@@ -2272,7 +2290,7 @@
                 <w:sz w:val="22"/>
                 <w:szCs w:val="22"/>
               </w:rPr>
-              <w:t xml:space="preserve">Left-click a second point</w:t>
+              <w:t xml:space="preserve">Click "Proceed to tangent picking"</w:t>
             </w:r>
             <w:r>
               <w:rPr>
@@ -2282,7 +2300,7 @@
                 <w:sz w:val="22"/>
                 <w:szCs w:val="22"/>
               </w:rPr>
-              <w:t xml:space="preserve"> further along the same edge, in the same direction. A gold line is drawn through the two points, extended across the full image.</w:t>
+              <w:t xml:space="preserve"> to close the reference window and move to the tangent-picker windows. Only non-parallel planes will open.</w:t>
             </w:r>
           </w:p>
         </w:tc>
@@ -2351,7 +2369,7 @@
                 <w:sz w:val="22"/>
                 <w:szCs w:val="22"/>
               </w:rPr>
-              <w:t xml:space="preserve">Check the line</w:t>
+              <w:t xml:space="preserve">Click "Skip this point entirely"</w:t>
             </w:r>
             <w:r>
               <w:rPr>
@@ -2361,86 +2379,7 @@
                 <w:sz w:val="22"/>
                 <w:szCs w:val="22"/>
               </w:rPr>
-              <w:t xml:space="preserve"> — it should run parallel to the nuclear envelope boundary near the crosshair. If it does not look right, right-click anywhere to clear the selection and start again.</w:t>
-            </w:r>
-          </w:p>
-        </w:tc>
-      </w:tr>
-      <w:tr>
-        <w:tc>
-          <w:tcPr>
-            <w:tcW w:type="dxa" w:w="1200"/>
-            <w:tcBorders>
-              <w:top w:val="single" w:color="B4C7E7" w:sz="1"/>
-              <w:left w:val="single" w:color="B4C7E7" w:sz="1"/>
-              <w:bottom w:val="single" w:color="B4C7E7" w:sz="1"/>
-              <w:right w:val="single" w:color="B4C7E7" w:sz="1"/>
-            </w:tcBorders>
-            <w:shd w:fill="FFFFFF" w:val="clear"/>
-            <w:tcMar>
-              <w:top w:type="dxa" w:w="80"/>
-              <w:left w:type="dxa" w:w="120"/>
-              <w:bottom w:type="dxa" w:w="80"/>
-              <w:right w:type="dxa" w:w="120"/>
-            </w:tcMar>
-          </w:tcPr>
-          <w:p>
-            <w:pPr>
-              <w:jc w:val="center"/>
-            </w:pPr>
-            <w:r>
-              <w:rPr>
-                <w:rFonts w:ascii="Arial" w:cs="Arial" w:eastAsia="Arial" w:hAnsi="Arial"/>
-                <w:b/>
-                <w:bCs/>
-                <w:color w:val="2E75B6"/>
-                <w:sz w:val="22"/>
-                <w:szCs w:val="22"/>
-              </w:rPr>
-              <w:t xml:space="preserve">5</w:t>
-            </w:r>
-          </w:p>
-        </w:tc>
-        <w:tc>
-          <w:tcPr>
-            <w:tcW w:type="dxa" w:w="8160"/>
-            <w:tcBorders>
-              <w:top w:val="single" w:color="B4C7E7" w:sz="1"/>
-              <w:left w:val="single" w:color="B4C7E7" w:sz="1"/>
-              <w:bottom w:val="single" w:color="B4C7E7" w:sz="1"/>
-              <w:right w:val="single" w:color="B4C7E7" w:sz="1"/>
-            </w:tcBorders>
-            <w:shd w:fill="FFFFFF" w:val="clear"/>
-            <w:tcMar>
-              <w:top w:type="dxa" w:w="80"/>
-              <w:left w:type="dxa" w:w="120"/>
-              <w:bottom w:type="dxa" w:w="80"/>
-              <w:right w:type="dxa" w:w="120"/>
-            </w:tcMar>
-          </w:tcPr>
-          <w:p>
-            <w:pPr>
-              <w:spacing w:before="0" w:after="0"/>
-            </w:pPr>
-            <w:r>
-              <w:rPr>
-                <w:rFonts w:ascii="Arial" w:cs="Arial" w:eastAsia="Arial" w:hAnsi="Arial"/>
-                <w:b/>
-                <w:bCs/>
-                <w:sz w:val="22"/>
-                <w:szCs w:val="22"/>
-              </w:rPr>
-              <w:t xml:space="preserve">Close the window</w:t>
-            </w:r>
-            <w:r>
-              <w:rPr>
-                <w:rFonts w:ascii="Arial" w:cs="Arial" w:eastAsia="Arial" w:hAnsi="Arial"/>
-                <w:b w:val="false"/>
-                <w:bCs w:val="false"/>
-                <w:sz w:val="22"/>
-                <w:szCs w:val="22"/>
-              </w:rPr>
-              <w:t xml:space="preserve"> once the title bar shows a green tick and the word "done". The next window will open automatically.</w:t>
+              <w:t xml:space="preserve"> if you want to bypass this point altogether (for example if the image quality is too poor). The spreadsheet row is marked "skipped" and the batch loop moves to the next point.</w:t>
             </w:r>
           </w:p>
         </w:tc>
@@ -2497,7 +2436,7 @@
                 <w:sz w:val="22"/>
                 <w:szCs w:val="22"/>
               </w:rPr>
-              <w:t xml:space="preserve">What makes a good tangent line?</w:t>
+              <w:t xml:space="preserve">When is the membrane parallel to a plane?</w:t>
             </w:r>
           </w:p>
           <w:p>
@@ -2510,7 +2449,7 @@
                 <w:sz w:val="21"/>
                 <w:szCs w:val="21"/>
               </w:rPr>
-              <w:t xml:space="preserve">The line should be tangent to (run along) the nuclear surface at the crosshair location, not cutting across it at an angle.</w:t>
+              <w:t xml:space="preserve">A plane is parallel to the membrane if the nuclear envelope appears as a sharp horizontal or vertical line running across the full width or height of that cross-section.</w:t>
             </w:r>
           </w:p>
           <w:p>
@@ -2523,7 +2462,7 @@
                 <w:sz w:val="21"/>
                 <w:szCs w:val="21"/>
               </w:rPr>
-              <w:t xml:space="preserve">Place your two clicks on either side of the crosshair, not both on the same side.</w:t>
+              <w:t xml:space="preserve">In the XY plane: if the membrane runs as a flat horizontal band, it is parallel to XY.</w:t>
             </w:r>
           </w:p>
           <w:p>
@@ -2536,7 +2475,7 @@
                 <w:sz w:val="21"/>
                 <w:szCs w:val="21"/>
               </w:rPr>
-              <w:t xml:space="preserve">Zoom in if the envelope boundary is not clearly visible at the default zoom (see Section 5).</w:t>
+              <w:t xml:space="preserve">In the XZ or YZ planes: look for a near-horizontal stripe with no visible curvature near the crosshair.</w:t>
             </w:r>
           </w:p>
           <w:p>
@@ -2549,7 +2488,7 @@
                 <w:sz w:val="21"/>
                 <w:szCs w:val="21"/>
               </w:rPr>
-              <w:t xml:space="preserve">A short stretch of clearly visible envelope is sufficient — the line is extrapolated mathematically.</w:t>
+              <w:t xml:space="preserve">If in doubt, leave the plane unticked — the SVD fitting is robust and a slightly oblique tangent in one plane is far better than omitting it entirely.</w:t>
             </w:r>
           </w:p>
           <w:p>
@@ -2562,7 +2501,7 @@
                 <w:sz w:val="21"/>
                 <w:szCs w:val="21"/>
               </w:rPr>
-              <w:t xml:space="preserve">The three tangent lines do not need to be perfectly consistent; the SVD fitting process is robust to small errors.</w:t>
+              <w:t xml:space="preserve">If two planes are parallel, the program switches automatically from SVD to a cross-product calculation using the two remaining tangents.</w:t>
             </w:r>
           </w:p>
         </w:tc>
@@ -2586,7 +2525,647 @@
           <w:sz w:val="28"/>
           <w:szCs w:val="28"/>
         </w:rPr>
-        <w:t xml:space="preserve">4.4  Interpreting the condition number</w:t>
+        <w:t xml:space="preserve">4.4  How to draw a tangent line</w:t>
+      </w:r>
+    </w:p>
+    <w:p>
+      <w:pPr>
+        <w:spacing w:before="60" w:after="100"/>
+      </w:pPr>
+      <w:r>
+        <w:rPr>
+          <w:rFonts w:ascii="Arial" w:cs="Arial" w:eastAsia="Arial" w:hAnsi="Arial"/>
+          <w:sz w:val="22"/>
+          <w:szCs w:val="22"/>
+        </w:rPr>
+        <w:t xml:space="preserve">Follow these steps in each tangent-picker window:</w:t>
+      </w:r>
+    </w:p>
+    <w:p>
+      <w:pPr>
+        <w:spacing w:before="80" w:after="0"/>
+      </w:pPr>
+    </w:p>
+    <w:tbl>
+      <w:tblPr>
+        <w:tblW w:type="dxa" w:w="9360"/>
+        <w:tblBorders>
+          <w:top w:val="single" w:color="auto" w:sz="4"/>
+          <w:left w:val="single" w:color="auto" w:sz="4"/>
+          <w:bottom w:val="single" w:color="auto" w:sz="4"/>
+          <w:right w:val="single" w:color="auto" w:sz="4"/>
+          <w:insideH w:val="single" w:color="auto" w:sz="4"/>
+          <w:insideV w:val="single" w:color="auto" w:sz="4"/>
+        </w:tblBorders>
+      </w:tblPr>
+      <w:tblGrid>
+        <w:gridCol w:w="1200"/>
+        <w:gridCol w:w="8160"/>
+      </w:tblGrid>
+      <w:tr>
+        <w:trPr>
+          <w:tblHeader/>
+        </w:trPr>
+        <w:tc>
+          <w:tcPr>
+            <w:tcW w:type="dxa" w:w="1200"/>
+            <w:tcBorders>
+              <w:top w:val="single" w:color="B4C7E7" w:sz="1"/>
+              <w:left w:val="single" w:color="B4C7E7" w:sz="1"/>
+              <w:bottom w:val="single" w:color="B4C7E7" w:sz="1"/>
+              <w:right w:val="single" w:color="B4C7E7" w:sz="1"/>
+            </w:tcBorders>
+            <w:shd w:fill="D6E4F0" w:val="clear"/>
+            <w:tcMar>
+              <w:top w:type="dxa" w:w="80"/>
+              <w:left w:type="dxa" w:w="120"/>
+              <w:bottom w:type="dxa" w:w="80"/>
+              <w:right w:type="dxa" w:w="120"/>
+            </w:tcMar>
+          </w:tcPr>
+          <w:p>
+            <w:r>
+              <w:rPr>
+                <w:rFonts w:ascii="Arial" w:cs="Arial" w:eastAsia="Arial" w:hAnsi="Arial"/>
+                <w:b/>
+                <w:bCs/>
+                <w:color w:val="1F4E79"/>
+                <w:sz w:val="22"/>
+                <w:szCs w:val="22"/>
+              </w:rPr>
+              <w:t xml:space="preserve">Step</w:t>
+            </w:r>
+          </w:p>
+        </w:tc>
+        <w:tc>
+          <w:tcPr>
+            <w:tcW w:type="dxa" w:w="8160"/>
+            <w:tcBorders>
+              <w:top w:val="single" w:color="B4C7E7" w:sz="1"/>
+              <w:left w:val="single" w:color="B4C7E7" w:sz="1"/>
+              <w:bottom w:val="single" w:color="B4C7E7" w:sz="1"/>
+              <w:right w:val="single" w:color="B4C7E7" w:sz="1"/>
+            </w:tcBorders>
+            <w:shd w:fill="D6E4F0" w:val="clear"/>
+            <w:tcMar>
+              <w:top w:type="dxa" w:w="80"/>
+              <w:left w:type="dxa" w:w="120"/>
+              <w:bottom w:type="dxa" w:w="80"/>
+              <w:right w:type="dxa" w:w="120"/>
+            </w:tcMar>
+          </w:tcPr>
+          <w:p>
+            <w:r>
+              <w:rPr>
+                <w:rFonts w:ascii="Arial" w:cs="Arial" w:eastAsia="Arial" w:hAnsi="Arial"/>
+                <w:b/>
+                <w:bCs/>
+                <w:color w:val="1F4E79"/>
+                <w:sz w:val="22"/>
+                <w:szCs w:val="22"/>
+              </w:rPr>
+              <w:t xml:space="preserve">Action</w:t>
+            </w:r>
+          </w:p>
+        </w:tc>
+      </w:tr>
+      <w:tr>
+        <w:tc>
+          <w:tcPr>
+            <w:tcW w:type="dxa" w:w="1200"/>
+            <w:tcBorders>
+              <w:top w:val="single" w:color="B4C7E7" w:sz="1"/>
+              <w:left w:val="single" w:color="B4C7E7" w:sz="1"/>
+              <w:bottom w:val="single" w:color="B4C7E7" w:sz="1"/>
+              <w:right w:val="single" w:color="B4C7E7" w:sz="1"/>
+            </w:tcBorders>
+            <w:shd w:fill="FFFFFF" w:val="clear"/>
+            <w:tcMar>
+              <w:top w:type="dxa" w:w="80"/>
+              <w:left w:type="dxa" w:w="120"/>
+              <w:bottom w:type="dxa" w:w="80"/>
+              <w:right w:type="dxa" w:w="120"/>
+            </w:tcMar>
+          </w:tcPr>
+          <w:p>
+            <w:pPr>
+              <w:jc w:val="center"/>
+            </w:pPr>
+            <w:r>
+              <w:rPr>
+                <w:rFonts w:ascii="Arial" w:cs="Arial" w:eastAsia="Arial" w:hAnsi="Arial"/>
+                <w:b/>
+                <w:bCs/>
+                <w:color w:val="2E75B6"/>
+                <w:sz w:val="22"/>
+                <w:szCs w:val="22"/>
+              </w:rPr>
+              <w:t xml:space="preserve">1</w:t>
+            </w:r>
+          </w:p>
+        </w:tc>
+        <w:tc>
+          <w:tcPr>
+            <w:tcW w:type="dxa" w:w="8160"/>
+            <w:tcBorders>
+              <w:top w:val="single" w:color="B4C7E7" w:sz="1"/>
+              <w:left w:val="single" w:color="B4C7E7" w:sz="1"/>
+              <w:bottom w:val="single" w:color="B4C7E7" w:sz="1"/>
+              <w:right w:val="single" w:color="B4C7E7" w:sz="1"/>
+            </w:tcBorders>
+            <w:shd w:fill="FFFFFF" w:val="clear"/>
+            <w:tcMar>
+              <w:top w:type="dxa" w:w="80"/>
+              <w:left w:type="dxa" w:w="120"/>
+              <w:bottom w:type="dxa" w:w="80"/>
+              <w:right w:type="dxa" w:w="120"/>
+            </w:tcMar>
+          </w:tcPr>
+          <w:p>
+            <w:pPr>
+              <w:spacing w:before="0" w:after="0"/>
+            </w:pPr>
+            <w:r>
+              <w:rPr>
+                <w:rFonts w:ascii="Arial" w:cs="Arial" w:eastAsia="Arial" w:hAnsi="Arial"/>
+                <w:b/>
+                <w:bCs/>
+                <w:sz w:val="22"/>
+                <w:szCs w:val="22"/>
+              </w:rPr>
+              <w:t xml:space="preserve">Locate the nuclear envelope</w:t>
+            </w:r>
+            <w:r>
+              <w:rPr>
+                <w:rFonts w:ascii="Arial" w:cs="Arial" w:eastAsia="Arial" w:hAnsi="Arial"/>
+                <w:b w:val="false"/>
+                <w:bCs w:val="false"/>
+                <w:sz w:val="22"/>
+                <w:szCs w:val="22"/>
+              </w:rPr>
+              <w:t xml:space="preserve"> in the image. It typically appears as a bright or dark ring. The red crosshairs mark the point of interest on the envelope.</w:t>
+            </w:r>
+          </w:p>
+        </w:tc>
+      </w:tr>
+      <w:tr>
+        <w:tc>
+          <w:tcPr>
+            <w:tcW w:type="dxa" w:w="1200"/>
+            <w:tcBorders>
+              <w:top w:val="single" w:color="B4C7E7" w:sz="1"/>
+              <w:left w:val="single" w:color="B4C7E7" w:sz="1"/>
+              <w:bottom w:val="single" w:color="B4C7E7" w:sz="1"/>
+              <w:right w:val="single" w:color="B4C7E7" w:sz="1"/>
+            </w:tcBorders>
+            <w:shd w:fill="EBF3FB" w:val="clear"/>
+            <w:tcMar>
+              <w:top w:type="dxa" w:w="80"/>
+              <w:left w:type="dxa" w:w="120"/>
+              <w:bottom w:type="dxa" w:w="80"/>
+              <w:right w:type="dxa" w:w="120"/>
+            </w:tcMar>
+          </w:tcPr>
+          <w:p>
+            <w:pPr>
+              <w:jc w:val="center"/>
+            </w:pPr>
+            <w:r>
+              <w:rPr>
+                <w:rFonts w:ascii="Arial" w:cs="Arial" w:eastAsia="Arial" w:hAnsi="Arial"/>
+                <w:b/>
+                <w:bCs/>
+                <w:color w:val="2E75B6"/>
+                <w:sz w:val="22"/>
+                <w:szCs w:val="22"/>
+              </w:rPr>
+              <w:t xml:space="preserve">2</w:t>
+            </w:r>
+          </w:p>
+        </w:tc>
+        <w:tc>
+          <w:tcPr>
+            <w:tcW w:type="dxa" w:w="8160"/>
+            <w:tcBorders>
+              <w:top w:val="single" w:color="B4C7E7" w:sz="1"/>
+              <w:left w:val="single" w:color="B4C7E7" w:sz="1"/>
+              <w:bottom w:val="single" w:color="B4C7E7" w:sz="1"/>
+              <w:right w:val="single" w:color="B4C7E7" w:sz="1"/>
+            </w:tcBorders>
+            <w:shd w:fill="EBF3FB" w:val="clear"/>
+            <w:tcMar>
+              <w:top w:type="dxa" w:w="80"/>
+              <w:left w:type="dxa" w:w="120"/>
+              <w:bottom w:type="dxa" w:w="80"/>
+              <w:right w:type="dxa" w:w="120"/>
+            </w:tcMar>
+          </w:tcPr>
+          <w:p>
+            <w:pPr>
+              <w:spacing w:before="0" w:after="0"/>
+            </w:pPr>
+            <w:r>
+              <w:rPr>
+                <w:rFonts w:ascii="Arial" w:cs="Arial" w:eastAsia="Arial" w:hAnsi="Arial"/>
+                <w:b/>
+                <w:bCs/>
+                <w:sz w:val="22"/>
+                <w:szCs w:val="22"/>
+              </w:rPr>
+              <w:t xml:space="preserve">Left-click the first point</w:t>
+            </w:r>
+            <w:r>
+              <w:rPr>
+                <w:rFonts w:ascii="Arial" w:cs="Arial" w:eastAsia="Arial" w:hAnsi="Arial"/>
+                <w:b w:val="false"/>
+                <w:bCs w:val="false"/>
+                <w:sz w:val="22"/>
+                <w:szCs w:val="22"/>
+              </w:rPr>
+              <w:t xml:space="preserve"> somewhere along the visible edge of the nuclear envelope, close to the crosshair. A yellow dot marks the click.</w:t>
+            </w:r>
+          </w:p>
+        </w:tc>
+      </w:tr>
+      <w:tr>
+        <w:tc>
+          <w:tcPr>
+            <w:tcW w:type="dxa" w:w="1200"/>
+            <w:tcBorders>
+              <w:top w:val="single" w:color="B4C7E7" w:sz="1"/>
+              <w:left w:val="single" w:color="B4C7E7" w:sz="1"/>
+              <w:bottom w:val="single" w:color="B4C7E7" w:sz="1"/>
+              <w:right w:val="single" w:color="B4C7E7" w:sz="1"/>
+            </w:tcBorders>
+            <w:shd w:fill="FFFFFF" w:val="clear"/>
+            <w:tcMar>
+              <w:top w:type="dxa" w:w="80"/>
+              <w:left w:type="dxa" w:w="120"/>
+              <w:bottom w:type="dxa" w:w="80"/>
+              <w:right w:type="dxa" w:w="120"/>
+            </w:tcMar>
+          </w:tcPr>
+          <w:p>
+            <w:pPr>
+              <w:jc w:val="center"/>
+            </w:pPr>
+            <w:r>
+              <w:rPr>
+                <w:rFonts w:ascii="Arial" w:cs="Arial" w:eastAsia="Arial" w:hAnsi="Arial"/>
+                <w:b/>
+                <w:bCs/>
+                <w:color w:val="2E75B6"/>
+                <w:sz w:val="22"/>
+                <w:szCs w:val="22"/>
+              </w:rPr>
+              <w:t xml:space="preserve">3</w:t>
+            </w:r>
+          </w:p>
+        </w:tc>
+        <w:tc>
+          <w:tcPr>
+            <w:tcW w:type="dxa" w:w="8160"/>
+            <w:tcBorders>
+              <w:top w:val="single" w:color="B4C7E7" w:sz="1"/>
+              <w:left w:val="single" w:color="B4C7E7" w:sz="1"/>
+              <w:bottom w:val="single" w:color="B4C7E7" w:sz="1"/>
+              <w:right w:val="single" w:color="B4C7E7" w:sz="1"/>
+            </w:tcBorders>
+            <w:shd w:fill="FFFFFF" w:val="clear"/>
+            <w:tcMar>
+              <w:top w:type="dxa" w:w="80"/>
+              <w:left w:type="dxa" w:w="120"/>
+              <w:bottom w:type="dxa" w:w="80"/>
+              <w:right w:type="dxa" w:w="120"/>
+            </w:tcMar>
+          </w:tcPr>
+          <w:p>
+            <w:pPr>
+              <w:spacing w:before="0" w:after="0"/>
+            </w:pPr>
+            <w:r>
+              <w:rPr>
+                <w:rFonts w:ascii="Arial" w:cs="Arial" w:eastAsia="Arial" w:hAnsi="Arial"/>
+                <w:b/>
+                <w:bCs/>
+                <w:sz w:val="22"/>
+                <w:szCs w:val="22"/>
+              </w:rPr>
+              <w:t xml:space="preserve">Left-click a second point</w:t>
+            </w:r>
+            <w:r>
+              <w:rPr>
+                <w:rFonts w:ascii="Arial" w:cs="Arial" w:eastAsia="Arial" w:hAnsi="Arial"/>
+                <w:b w:val="false"/>
+                <w:bCs w:val="false"/>
+                <w:sz w:val="22"/>
+                <w:szCs w:val="22"/>
+              </w:rPr>
+              <w:t xml:space="preserve"> further along the same edge, in the same direction. A gold line is drawn through the two points, extended across the full image.</w:t>
+            </w:r>
+          </w:p>
+        </w:tc>
+      </w:tr>
+      <w:tr>
+        <w:tc>
+          <w:tcPr>
+            <w:tcW w:type="dxa" w:w="1200"/>
+            <w:tcBorders>
+              <w:top w:val="single" w:color="B4C7E7" w:sz="1"/>
+              <w:left w:val="single" w:color="B4C7E7" w:sz="1"/>
+              <w:bottom w:val="single" w:color="B4C7E7" w:sz="1"/>
+              <w:right w:val="single" w:color="B4C7E7" w:sz="1"/>
+            </w:tcBorders>
+            <w:shd w:fill="EBF3FB" w:val="clear"/>
+            <w:tcMar>
+              <w:top w:type="dxa" w:w="80"/>
+              <w:left w:type="dxa" w:w="120"/>
+              <w:bottom w:type="dxa" w:w="80"/>
+              <w:right w:type="dxa" w:w="120"/>
+            </w:tcMar>
+          </w:tcPr>
+          <w:p>
+            <w:pPr>
+              <w:jc w:val="center"/>
+            </w:pPr>
+            <w:r>
+              <w:rPr>
+                <w:rFonts w:ascii="Arial" w:cs="Arial" w:eastAsia="Arial" w:hAnsi="Arial"/>
+                <w:b/>
+                <w:bCs/>
+                <w:color w:val="2E75B6"/>
+                <w:sz w:val="22"/>
+                <w:szCs w:val="22"/>
+              </w:rPr>
+              <w:t xml:space="preserve">4</w:t>
+            </w:r>
+          </w:p>
+        </w:tc>
+        <w:tc>
+          <w:tcPr>
+            <w:tcW w:type="dxa" w:w="8160"/>
+            <w:tcBorders>
+              <w:top w:val="single" w:color="B4C7E7" w:sz="1"/>
+              <w:left w:val="single" w:color="B4C7E7" w:sz="1"/>
+              <w:bottom w:val="single" w:color="B4C7E7" w:sz="1"/>
+              <w:right w:val="single" w:color="B4C7E7" w:sz="1"/>
+            </w:tcBorders>
+            <w:shd w:fill="EBF3FB" w:val="clear"/>
+            <w:tcMar>
+              <w:top w:type="dxa" w:w="80"/>
+              <w:left w:type="dxa" w:w="120"/>
+              <w:bottom w:type="dxa" w:w="80"/>
+              <w:right w:type="dxa" w:w="120"/>
+            </w:tcMar>
+          </w:tcPr>
+          <w:p>
+            <w:pPr>
+              <w:spacing w:before="0" w:after="0"/>
+            </w:pPr>
+            <w:r>
+              <w:rPr>
+                <w:rFonts w:ascii="Arial" w:cs="Arial" w:eastAsia="Arial" w:hAnsi="Arial"/>
+                <w:b/>
+                <w:bCs/>
+                <w:sz w:val="22"/>
+                <w:szCs w:val="22"/>
+              </w:rPr>
+              <w:t xml:space="preserve">Check the line</w:t>
+            </w:r>
+            <w:r>
+              <w:rPr>
+                <w:rFonts w:ascii="Arial" w:cs="Arial" w:eastAsia="Arial" w:hAnsi="Arial"/>
+                <w:b w:val="false"/>
+                <w:bCs w:val="false"/>
+                <w:sz w:val="22"/>
+                <w:szCs w:val="22"/>
+              </w:rPr>
+              <w:t xml:space="preserve"> — it should run parallel to the nuclear envelope boundary near the crosshair. If it does not look right, right-click anywhere to clear the selection and start again.</w:t>
+            </w:r>
+          </w:p>
+        </w:tc>
+      </w:tr>
+      <w:tr>
+        <w:tc>
+          <w:tcPr>
+            <w:tcW w:type="dxa" w:w="1200"/>
+            <w:tcBorders>
+              <w:top w:val="single" w:color="B4C7E7" w:sz="1"/>
+              <w:left w:val="single" w:color="B4C7E7" w:sz="1"/>
+              <w:bottom w:val="single" w:color="B4C7E7" w:sz="1"/>
+              <w:right w:val="single" w:color="B4C7E7" w:sz="1"/>
+            </w:tcBorders>
+            <w:shd w:fill="FFFFFF" w:val="clear"/>
+            <w:tcMar>
+              <w:top w:type="dxa" w:w="80"/>
+              <w:left w:type="dxa" w:w="120"/>
+              <w:bottom w:type="dxa" w:w="80"/>
+              <w:right w:type="dxa" w:w="120"/>
+            </w:tcMar>
+          </w:tcPr>
+          <w:p>
+            <w:pPr>
+              <w:jc w:val="center"/>
+            </w:pPr>
+            <w:r>
+              <w:rPr>
+                <w:rFonts w:ascii="Arial" w:cs="Arial" w:eastAsia="Arial" w:hAnsi="Arial"/>
+                <w:b/>
+                <w:bCs/>
+                <w:color w:val="2E75B6"/>
+                <w:sz w:val="22"/>
+                <w:szCs w:val="22"/>
+              </w:rPr>
+              <w:t xml:space="preserve">5</w:t>
+            </w:r>
+          </w:p>
+        </w:tc>
+        <w:tc>
+          <w:tcPr>
+            <w:tcW w:type="dxa" w:w="8160"/>
+            <w:tcBorders>
+              <w:top w:val="single" w:color="B4C7E7" w:sz="1"/>
+              <w:left w:val="single" w:color="B4C7E7" w:sz="1"/>
+              <w:bottom w:val="single" w:color="B4C7E7" w:sz="1"/>
+              <w:right w:val="single" w:color="B4C7E7" w:sz="1"/>
+            </w:tcBorders>
+            <w:shd w:fill="FFFFFF" w:val="clear"/>
+            <w:tcMar>
+              <w:top w:type="dxa" w:w="80"/>
+              <w:left w:type="dxa" w:w="120"/>
+              <w:bottom w:type="dxa" w:w="80"/>
+              <w:right w:type="dxa" w:w="120"/>
+            </w:tcMar>
+          </w:tcPr>
+          <w:p>
+            <w:pPr>
+              <w:spacing w:before="0" w:after="0"/>
+            </w:pPr>
+            <w:r>
+              <w:rPr>
+                <w:rFonts w:ascii="Arial" w:cs="Arial" w:eastAsia="Arial" w:hAnsi="Arial"/>
+                <w:b/>
+                <w:bCs/>
+                <w:sz w:val="22"/>
+                <w:szCs w:val="22"/>
+              </w:rPr>
+              <w:t xml:space="preserve">Close the window</w:t>
+            </w:r>
+            <w:r>
+              <w:rPr>
+                <w:rFonts w:ascii="Arial" w:cs="Arial" w:eastAsia="Arial" w:hAnsi="Arial"/>
+                <w:b w:val="false"/>
+                <w:bCs w:val="false"/>
+                <w:sz w:val="22"/>
+                <w:szCs w:val="22"/>
+              </w:rPr>
+              <w:t xml:space="preserve"> once the title bar shows a green tick and the word "done". The next window will open automatically.</w:t>
+            </w:r>
+          </w:p>
+        </w:tc>
+      </w:tr>
+    </w:tbl>
+    <w:p>
+      <w:pPr>
+        <w:spacing w:before="160" w:after="0"/>
+      </w:pPr>
+    </w:p>
+    <w:tbl>
+      <w:tblPr>
+        <w:tblW w:type="dxa" w:w="9360"/>
+        <w:tblBorders>
+          <w:top w:val="single" w:color="auto" w:sz="4"/>
+          <w:left w:val="single" w:color="auto" w:sz="4"/>
+          <w:bottom w:val="single" w:color="auto" w:sz="4"/>
+          <w:right w:val="single" w:color="auto" w:sz="4"/>
+          <w:insideH w:val="single" w:color="auto" w:sz="4"/>
+          <w:insideV w:val="single" w:color="auto" w:sz="4"/>
+        </w:tblBorders>
+      </w:tblPr>
+      <w:tblGrid>
+        <w:gridCol w:w="9360"/>
+      </w:tblGrid>
+      <w:tr>
+        <w:tc>
+          <w:tcPr>
+            <w:tcW w:type="dxa" w:w="9360"/>
+            <w:tcBorders>
+              <w:top w:val="none"/>
+              <w:left w:val="single" w:color="F4B942" w:sz="18"/>
+              <w:bottom w:val="none"/>
+              <w:right w:val="none"/>
+            </w:tcBorders>
+            <w:shd w:fill="FFF8F0" w:val="clear"/>
+            <w:tcMar>
+              <w:top w:type="dxa" w:w="100"/>
+              <w:left w:type="dxa" w:w="160"/>
+              <w:bottom w:type="dxa" w:w="100"/>
+              <w:right w:type="dxa" w:w="100"/>
+            </w:tcMar>
+          </w:tcPr>
+          <w:p>
+            <w:pPr>
+              <w:spacing w:before="0" w:after="80"/>
+            </w:pPr>
+            <w:r>
+              <w:rPr>
+                <w:rFonts w:ascii="Arial" w:cs="Arial" w:eastAsia="Arial" w:hAnsi="Arial"/>
+                <w:b/>
+                <w:bCs/>
+                <w:color w:val="1F4E79"/>
+                <w:sz w:val="22"/>
+                <w:szCs w:val="22"/>
+              </w:rPr>
+              <w:t xml:space="preserve">What makes a good tangent line?</w:t>
+            </w:r>
+          </w:p>
+          <w:p>
+            <w:pPr>
+              <w:spacing w:before="0" w:after="60"/>
+            </w:pPr>
+            <w:r>
+              <w:rPr>
+                <w:rFonts w:ascii="Arial" w:cs="Arial" w:eastAsia="Arial" w:hAnsi="Arial"/>
+                <w:sz w:val="21"/>
+                <w:szCs w:val="21"/>
+              </w:rPr>
+              <w:t xml:space="preserve">The line should be tangent to (run along) the nuclear surface at the crosshair location, not cutting across it at an angle.</w:t>
+            </w:r>
+          </w:p>
+          <w:p>
+            <w:pPr>
+              <w:spacing w:before="0" w:after="60"/>
+            </w:pPr>
+            <w:r>
+              <w:rPr>
+                <w:rFonts w:ascii="Arial" w:cs="Arial" w:eastAsia="Arial" w:hAnsi="Arial"/>
+                <w:sz w:val="21"/>
+                <w:szCs w:val="21"/>
+              </w:rPr>
+              <w:t xml:space="preserve">Place your two clicks on either side of the crosshair, not both on the same side.</w:t>
+            </w:r>
+          </w:p>
+          <w:p>
+            <w:pPr>
+              <w:spacing w:before="0" w:after="60"/>
+            </w:pPr>
+            <w:r>
+              <w:rPr>
+                <w:rFonts w:ascii="Arial" w:cs="Arial" w:eastAsia="Arial" w:hAnsi="Arial"/>
+                <w:sz w:val="21"/>
+                <w:szCs w:val="21"/>
+              </w:rPr>
+              <w:t xml:space="preserve">Zoom in if the envelope boundary is not clearly visible at the default zoom (see Section 5).</w:t>
+            </w:r>
+          </w:p>
+          <w:p>
+            <w:pPr>
+              <w:spacing w:before="0" w:after="60"/>
+            </w:pPr>
+            <w:r>
+              <w:rPr>
+                <w:rFonts w:ascii="Arial" w:cs="Arial" w:eastAsia="Arial" w:hAnsi="Arial"/>
+                <w:sz w:val="21"/>
+                <w:szCs w:val="21"/>
+              </w:rPr>
+              <w:t xml:space="preserve">A short stretch of clearly visible envelope is sufficient — the line is extrapolated mathematically.</w:t>
+            </w:r>
+          </w:p>
+          <w:p>
+            <w:pPr>
+              <w:spacing w:before="0" w:after="60"/>
+            </w:pPr>
+            <w:r>
+              <w:rPr>
+                <w:rFonts w:ascii="Arial" w:cs="Arial" w:eastAsia="Arial" w:hAnsi="Arial"/>
+                <w:sz w:val="21"/>
+                <w:szCs w:val="21"/>
+              </w:rPr>
+              <w:t xml:space="preserve">The three tangent lines do not need to be perfectly consistent; the SVD fitting process is robust to small errors.</w:t>
+            </w:r>
+          </w:p>
+        </w:tc>
+      </w:tr>
+    </w:tbl>
+    <w:p>
+      <w:pPr>
+        <w:spacing w:before="120" w:after="0"/>
+      </w:pPr>
+    </w:p>
+    <w:p>
+      <w:pPr>
+        <w:pStyle w:val="Heading2"/>
+      </w:pPr>
+      <w:r>
+        <w:rPr>
+          <w:rFonts w:ascii="Arial" w:cs="Arial" w:eastAsia="Arial" w:hAnsi="Arial"/>
+          <w:b/>
+          <w:bCs/>
+          <w:color w:val="2E75B6"/>
+          <w:sz w:val="28"/>
+          <w:szCs w:val="28"/>
+        </w:rPr>
+        <w:t xml:space="preserve">4.5  Interpreting the condition number</w:t>
       </w:r>
     </w:p>
     <w:p>
@@ -4801,6 +5380,126 @@
                 <w:sz w:val="22"/>
                 <w:szCs w:val="22"/>
               </w:rPr>
+              <w:t xml:space="preserve">Plane buttons in the dialog do not turn green</w:t>
+            </w:r>
+          </w:p>
+        </w:tc>
+        <w:tc>
+          <w:tcPr>
+            <w:tcW w:type="dxa" w:w="5760"/>
+            <w:tcBorders>
+              <w:top w:val="single" w:color="B4C7E7" w:sz="1"/>
+              <w:left w:val="single" w:color="B4C7E7" w:sz="1"/>
+              <w:bottom w:val="single" w:color="B4C7E7" w:sz="1"/>
+              <w:right w:val="single" w:color="B4C7E7" w:sz="1"/>
+            </w:tcBorders>
+            <w:shd w:fill="EBF3FB" w:val="clear"/>
+            <w:tcMar>
+              <w:top w:type="dxa" w:w="80"/>
+              <w:left w:type="dxa" w:w="120"/>
+              <w:bottom w:type="dxa" w:w="80"/>
+              <w:right w:type="dxa" w:w="120"/>
+            </w:tcMar>
+          </w:tcPr>
+          <w:p>
+            <w:r>
+              <w:rPr>
+                <w:rFonts w:ascii="Arial" w:cs="Arial" w:eastAsia="Arial" w:hAnsi="Arial"/>
+                <w:sz w:val="22"/>
+                <w:szCs w:val="22"/>
+              </w:rPr>
+              <w:t xml:space="preserve">Click the plane button once to toggle it on (it should turn green with "[parallel]" text). Click again to toggle off.</w:t>
+            </w:r>
+          </w:p>
+        </w:tc>
+      </w:tr>
+      <w:tr>
+        <w:tc>
+          <w:tcPr>
+            <w:tcW w:type="dxa" w:w="3600"/>
+            <w:tcBorders>
+              <w:top w:val="single" w:color="B4C7E7" w:sz="1"/>
+              <w:left w:val="single" w:color="B4C7E7" w:sz="1"/>
+              <w:bottom w:val="single" w:color="B4C7E7" w:sz="1"/>
+              <w:right w:val="single" w:color="B4C7E7" w:sz="1"/>
+            </w:tcBorders>
+            <w:shd w:fill="FFFFFF" w:val="clear"/>
+            <w:tcMar>
+              <w:top w:type="dxa" w:w="80"/>
+              <w:left w:type="dxa" w:w="120"/>
+              <w:bottom w:type="dxa" w:w="80"/>
+              <w:right w:type="dxa" w:w="120"/>
+            </w:tcMar>
+          </w:tcPr>
+          <w:p>
+            <w:r>
+              <w:rPr>
+                <w:rFonts w:ascii="Arial" w:cs="Arial" w:eastAsia="Arial" w:hAnsi="Arial"/>
+                <w:b/>
+                <w:bCs/>
+                <w:sz w:val="22"/>
+                <w:szCs w:val="22"/>
+              </w:rPr>
+              <w:t xml:space="preserve">A point was skipped by mistake</w:t>
+            </w:r>
+          </w:p>
+        </w:tc>
+        <w:tc>
+          <w:tcPr>
+            <w:tcW w:type="dxa" w:w="5760"/>
+            <w:tcBorders>
+              <w:top w:val="single" w:color="B4C7E7" w:sz="1"/>
+              <w:left w:val="single" w:color="B4C7E7" w:sz="1"/>
+              <w:bottom w:val="single" w:color="B4C7E7" w:sz="1"/>
+              <w:right w:val="single" w:color="B4C7E7" w:sz="1"/>
+            </w:tcBorders>
+            <w:shd w:fill="FFFFFF" w:val="clear"/>
+            <w:tcMar>
+              <w:top w:type="dxa" w:w="80"/>
+              <w:left w:type="dxa" w:w="120"/>
+              <w:bottom w:type="dxa" w:w="80"/>
+              <w:right w:type="dxa" w:w="120"/>
+            </w:tcMar>
+          </w:tcPr>
+          <w:p>
+            <w:r>
+              <w:rPr>
+                <w:rFonts w:ascii="Arial" w:cs="Arial" w:eastAsia="Arial" w:hAnsi="Arial"/>
+                <w:sz w:val="22"/>
+                <w:szCs w:val="22"/>
+              </w:rPr>
+              <w:t xml:space="preserve">Find the row in the spreadsheet and clear its status column (remove the word "skipped"). Re-run Cell 6 — the point will be processed again.</w:t>
+            </w:r>
+          </w:p>
+        </w:tc>
+      </w:tr>
+      <w:tr>
+        <w:tc>
+          <w:tcPr>
+            <w:tcW w:type="dxa" w:w="3600"/>
+            <w:tcBorders>
+              <w:top w:val="single" w:color="B4C7E7" w:sz="1"/>
+              <w:left w:val="single" w:color="B4C7E7" w:sz="1"/>
+              <w:bottom w:val="single" w:color="B4C7E7" w:sz="1"/>
+              <w:right w:val="single" w:color="B4C7E7" w:sz="1"/>
+            </w:tcBorders>
+            <w:shd w:fill="EBF3FB" w:val="clear"/>
+            <w:tcMar>
+              <w:top w:type="dxa" w:w="80"/>
+              <w:left w:type="dxa" w:w="120"/>
+              <w:bottom w:type="dxa" w:w="80"/>
+              <w:right w:type="dxa" w:w="120"/>
+            </w:tcMar>
+          </w:tcPr>
+          <w:p>
+            <w:r>
+              <w:rPr>
+                <w:rFonts w:ascii="Arial" w:cs="Arial" w:eastAsia="Arial" w:hAnsi="Arial"/>
+                <w:b/>
+                <w:bCs/>
+                <w:sz w:val="22"/>
+                <w:szCs w:val="22"/>
+              </w:rPr>
               <w:t xml:space="preserve">Condition number above 100</w:t>
             </w:r>
           </w:p>
@@ -4829,7 +5528,7 @@
                 <w:sz w:val="22"/>
                 <w:szCs w:val="22"/>
               </w:rPr>
-              <w:t xml:space="preserve">Two or more tangent lines may be nearly parallel in 3-D. Re-run Cell 6 for the affected point and redraw the XZ or YZ tangent at a different angle.</w:t>
+              <w:t xml:space="preserve">Two or more tangent lines may be nearly parallel in 3-D. Re-run Cell 6 for the point and redraw the XZ or YZ tangent at a different angle. If a plane is genuinely parallel to the membrane, flag it in the parallel-planes dialog instead.</w:t>
             </w:r>
           </w:p>
         </w:tc>

</xml_diff>

<commit_message>
V9: parallel-plane dialog, status-based skipping, tangent redo
</commit_message>
<xml_diff>
--- a/MRC_Reslice_User_Guide.docx
+++ b/MRC_Reslice_User_Guide.docx
@@ -1699,7 +1699,20 @@
                 <w:sz w:val="21"/>
                 <w:szCs w:val="21"/>
               </w:rPr>
-              <w:t xml:space="preserve">Points already marked "done" in the status column are automatically skipped when you re-run Cell 6.</w:t>
+              <w:t xml:space="preserve">Cell 6 skips any point whose status column is not blank — this includes "done", "skipped", and "error". Only points with a blank status are processed.</w:t>
+            </w:r>
+          </w:p>
+          <w:p>
+            <w:pPr>
+              <w:spacing w:before="0" w:after="60"/>
+            </w:pPr>
+            <w:r>
+              <w:rPr>
+                <w:rFonts w:ascii="Arial" w:cs="Arial" w:eastAsia="Arial" w:hAnsi="Arial"/>
+                <w:sz w:val="21"/>
+                <w:szCs w:val="21"/>
+              </w:rPr>
+              <w:t xml:space="preserve">To reprocess a completed point, clear its status cell in the spreadsheet and re-run Cell 6.</w:t>
             </w:r>
           </w:p>
         </w:tc>
@@ -2940,7 +2953,7 @@
                 <w:sz w:val="22"/>
                 <w:szCs w:val="22"/>
               </w:rPr>
-              <w:t xml:space="preserve"> — it should run parallel to the nuclear envelope boundary near the crosshair. If it does not look right, right-click anywhere to clear the selection and start again.</w:t>
+              <w:t xml:space="preserve"> — it should run parallel to the nuclear envelope boundary near the crosshair. If it does not look right, right-click or double-click anywhere in the image to clear all points and start again.</w:t>
             </w:r>
           </w:p>
         </w:tc>
@@ -5289,6 +5302,66 @@
                 <w:szCs w:val="22"/>
               </w:rPr>
               <w:t xml:space="preserve">A navigation tool (zoom or pan) may still be active. Click the active toolbar button again to deactivate it, then try clicking in the image.</w:t>
+            </w:r>
+          </w:p>
+        </w:tc>
+      </w:tr>
+      <w:tr>
+        <w:tc>
+          <w:tcPr>
+            <w:tcW w:type="dxa" w:w="3600"/>
+            <w:tcBorders>
+              <w:top w:val="single" w:color="B4C7E7" w:sz="1"/>
+              <w:left w:val="single" w:color="B4C7E7" w:sz="1"/>
+              <w:bottom w:val="single" w:color="B4C7E7" w:sz="1"/>
+              <w:right w:val="single" w:color="B4C7E7" w:sz="1"/>
+            </w:tcBorders>
+            <w:shd w:fill="FFFFFF" w:val="clear"/>
+            <w:tcMar>
+              <w:top w:type="dxa" w:w="80"/>
+              <w:left w:type="dxa" w:w="120"/>
+              <w:bottom w:type="dxa" w:w="80"/>
+              <w:right w:type="dxa" w:w="120"/>
+            </w:tcMar>
+          </w:tcPr>
+          <w:p>
+            <w:r>
+              <w:rPr>
+                <w:rFonts w:ascii="Arial" w:cs="Arial" w:eastAsia="Arial" w:hAnsi="Arial"/>
+                <w:b/>
+                <w:bCs/>
+                <w:sz w:val="22"/>
+                <w:szCs w:val="22"/>
+              </w:rPr>
+              <w:t xml:space="preserve">Cannot clear a misplaced tangent line</w:t>
+            </w:r>
+          </w:p>
+        </w:tc>
+        <w:tc>
+          <w:tcPr>
+            <w:tcW w:type="dxa" w:w="5760"/>
+            <w:tcBorders>
+              <w:top w:val="single" w:color="B4C7E7" w:sz="1"/>
+              <w:left w:val="single" w:color="B4C7E7" w:sz="1"/>
+              <w:bottom w:val="single" w:color="B4C7E7" w:sz="1"/>
+              <w:right w:val="single" w:color="B4C7E7" w:sz="1"/>
+            </w:tcBorders>
+            <w:shd w:fill="FFFFFF" w:val="clear"/>
+            <w:tcMar>
+              <w:top w:type="dxa" w:w="80"/>
+              <w:left w:type="dxa" w:w="120"/>
+              <w:bottom w:type="dxa" w:w="80"/>
+              <w:right w:type="dxa" w:w="120"/>
+            </w:tcMar>
+          </w:tcPr>
+          <w:p>
+            <w:r>
+              <w:rPr>
+                <w:rFonts w:ascii="Arial" w:cs="Arial" w:eastAsia="Arial" w:hAnsi="Arial"/>
+                <w:sz w:val="22"/>
+                <w:szCs w:val="22"/>
+              </w:rPr>
+              <w:t xml:space="preserve">Right-click anywhere in the image to clear all points and start over. On macOS the right-click may be intercepted by the OS — use a double left-click as an alternative.</w:t>
             </w:r>
           </w:p>
         </w:tc>

</xml_diff>

<commit_message>
Add reference PNG export with crosshairs for ortho slices
</commit_message>
<xml_diff>
--- a/MRC_Reslice_User_Guide.docx
+++ b/MRC_Reslice_User_Guide.docx
@@ -1715,6 +1715,19 @@
               <w:t xml:space="preserve">To reprocess a completed point, clear its status cell in the spreadsheet and re-run Cell 6.</w:t>
             </w:r>
           </w:p>
+          <w:p>
+            <w:pPr>
+              <w:spacing w:before="0" w:after="60"/>
+            </w:pPr>
+            <w:r>
+              <w:rPr>
+                <w:rFonts w:ascii="Arial" w:cs="Arial" w:eastAsia="Arial" w:hAnsi="Arial"/>
+                <w:sz w:val="21"/>
+                <w:szCs w:val="21"/>
+              </w:rPr>
+              <w:t xml:space="preserve">When SAVE_ORTHO_TIFFS is True, reference PNG images with red crosshairs are also saved automatically alongside the TIFFs — no extra configuration is needed.</w:t>
+            </w:r>
+          </w:p>
         </w:tc>
       </w:tr>
     </w:tbl>
@@ -5055,7 +5068,7 @@
                 <w:sz w:val="22"/>
                 <w:szCs w:val="22"/>
               </w:rPr>
-              <w:t xml:space="preserve">(Optional) TIFF files of the XY, XZ, and YZ reference slices for this point.</w:t>
+              <w:t xml:space="preserve">(Optional) Full bit-depth TIFF files of the XY, XZ, and YZ slices, plus four annotated reference PNG images with red crosshairs marking the surface point: one per plane (XY, XZ, YZ) and one combined overview. Saved when SAVE_ORTHO_TIFFS = True.</w:t>
             </w:r>
           </w:p>
         </w:tc>

</xml_diff>